<commit_message>
DA1: strip every legend and caption out of the diagrams
The figures now hold the diagram and nothing else. Gone from the PNGs: the
Chen-notation subtitle and the relationship summary box on the ER model, the
subtitle, the seven italic feature labels and the "what EER adds" box on the
EER model, the bold-box legend under the decomposition tree, and the key
legend and two summary lines under the final schema.

Nothing is lost, it just moved into the report, which already carried most of
it. Section 5 gains a paragraph on the five pieces of EER notation (double
ellipse, composite tree, dashed ellipse, the d circle, single against double
line into a specialization), and section 10 gains the grouping and the
underline-and-italic key legend.

Dropped note() and panel() and the canvas subtitle parameter with them, since
nothing draws prose any more.
</commit_message>
<xml_diff>
--- a/docs/DA1_Report.docx
+++ b/docs/DA1_Report.docx
@@ -1312,7 +1312,7 @@
       <w:r>
         <w:drawing>
           <wp:inline xmlns:a="http://schemas.openxmlformats.org/drawingml/2006/main" xmlns:pic="http://schemas.openxmlformats.org/drawingml/2006/picture">
-            <wp:extent cx="6400800" cy="3759331"/>
+            <wp:extent cx="6400800" cy="3375670"/>
             <wp:docPr id="1" name="Picture 1"/>
             <wp:cNvGraphicFramePr>
               <a:graphicFrameLocks noChangeAspect="1"/>
@@ -1333,7 +1333,7 @@
                   <pic:spPr>
                     <a:xfrm>
                       <a:off x="0" y="0"/>
-                      <a:ext cx="6400800" cy="3759331"/>
+                      <a:ext cx="6400800" cy="3375670"/>
                     </a:xfrm>
                     <a:prstGeom prst="rect"/>
                   </pic:spPr>
@@ -1385,7 +1385,7 @@
       <w:r>
         <w:drawing>
           <wp:inline xmlns:a="http://schemas.openxmlformats.org/drawingml/2006/main" xmlns:pic="http://schemas.openxmlformats.org/drawingml/2006/picture">
-            <wp:extent cx="6400800" cy="3568817"/>
+            <wp:extent cx="6400800" cy="3250110"/>
             <wp:docPr id="2" name="Picture 2"/>
             <wp:cNvGraphicFramePr>
               <a:graphicFrameLocks noChangeAspect="1"/>
@@ -1406,7 +1406,7 @@
                   <pic:spPr>
                     <a:xfrm>
                       <a:off x="0" y="0"/>
-                      <a:ext cx="6400800" cy="3568817"/>
+                      <a:ext cx="6400800" cy="3250110"/>
                     </a:xfrm>
                     <a:prstGeom prst="rect"/>
                   </pic:spPr>
@@ -1428,6 +1428,16 @@
           <w:sz w:val="18"/>
         </w:rPr>
         <w:t>Figure 2. The same model, extended with EER features</w:t>
+      </w:r>
+    </w:p>
+    <w:p>
+      <w:r>
+        <w:rPr>
+          <w:b w:val="0"/>
+          <w:i w:val="0"/>
+          <w:sz w:val="22"/>
+        </w:rPr>
+        <w:t>Five pieces of notation appear in Figure 2 that Figure 1 does not need. A double ellipse is a multivalued attribute, so SUPPLIER.Phone is drawn that way. A composite attribute is drawn as an ellipse with its parts hanging below it, which is how CUSTOMER.Address carries Street, City and Pincode. A dashed ellipse is a derived attribute, used for ORDERS.TotalAmt. A circle marked 'd' on a specialization means the subclasses are disjoint, and the line running into that circle is doubled when the specialization is total: EMPLOYEE has a double line because every employee is a manager or a driver, while PRODUCT has a single line because most products are not perishable. A weak entity has a double border and reaches its owner through a double diamond, which is why ORDER_ITEM and HAS are drawn that way.</w:t>
       </w:r>
     </w:p>
     <w:p>
@@ -3454,7 +3464,7 @@
       <w:r>
         <w:drawing>
           <wp:inline xmlns:a="http://schemas.openxmlformats.org/drawingml/2006/main" xmlns:pic="http://schemas.openxmlformats.org/drawingml/2006/picture">
-            <wp:extent cx="6400800" cy="4000125"/>
+            <wp:extent cx="6400800" cy="3928105"/>
             <wp:docPr id="9" name="Picture 9"/>
             <wp:cNvGraphicFramePr>
               <a:graphicFrameLocks noChangeAspect="1"/>
@@ -3475,7 +3485,7 @@
                   <pic:spPr>
                     <a:xfrm>
                       <a:off x="0" y="0"/>
-                      <a:ext cx="6400800" cy="4000125"/>
+                      <a:ext cx="6400800" cy="3928105"/>
                     </a:xfrm>
                     <a:prstGeom prst="rect"/>
                   </pic:spPr>
@@ -3527,7 +3537,7 @@
           <w:i w:val="0"/>
           <w:sz w:val="22"/>
         </w:rPr>
-        <w:t>The finished design has 17 tables and every one of them is in BCNF, which also means every one is in 1NF, 2NF and 3NF.</w:t>
+        <w:t>The finished design has 17 tables and every one of them is in BCNF, which also means every one is in 1NF, 2NF and 3NF. In Figure 10 the tables are grouped under three headings, master data, warehouse and staff, and stock and orders. A column name is underlined where it forms part of the primary key and italicised where it is a foreign key, so a column that is both is underlined and italic.</w:t>
       </w:r>
     </w:p>
     <w:p>
@@ -3537,7 +3547,7 @@
       <w:r>
         <w:drawing>
           <wp:inline xmlns:a="http://schemas.openxmlformats.org/drawingml/2006/main" xmlns:pic="http://schemas.openxmlformats.org/drawingml/2006/picture">
-            <wp:extent cx="6400800" cy="3590541"/>
+            <wp:extent cx="6400800" cy="2869324"/>
             <wp:docPr id="10" name="Picture 10"/>
             <wp:cNvGraphicFramePr>
               <a:graphicFrameLocks noChangeAspect="1"/>
@@ -3558,7 +3568,7 @@
                   <pic:spPr>
                     <a:xfrm>
                       <a:off x="0" y="0"/>
-                      <a:ext cx="6400800" cy="3590541"/>
+                      <a:ext cx="6400800" cy="2869324"/>
                     </a:xfrm>
                     <a:prstGeom prst="rect"/>
                   </pic:spPr>

</xml_diff>